<commit_message>
feat(about): refine narrative and presentation
</commit_message>
<xml_diff>
--- a/output/documents/About Me - current page text.docx
+++ b/output/documents/About Me - current page text.docx
@@ -25,13 +25,13 @@
         <w:rPr>
           <w:rFonts w:ascii="Arial" w:hAnsi="Arial" w:eastAsia="Arial" w:cs="Arial"/>
         </w:rPr>
-        <w:t>Working copy · based on the current About Me page · revised 4 August 2026</w:t>
+        <w:t>Working copy · based on the current About Me page · revised 5 August 2026</w:t>
       </w:r>
     </w:p>
     <w:p>
       <w:pPr/>
       <w:r>
-        <w:t>Hi, I’m Alex. I’m a designer at heart, and I love what I do.</w:t>
+        <w:t>Hi, I’m Alex. I’m a designer because I’m endlessly curious about how things work.</w:t>
       </w:r>
     </w:p>
     <w:p>
@@ -39,7 +39,7 @@
         <w:pStyle w:val="Heading1"/>
       </w:pPr>
       <w:r>
-        <w:t>I’ve always been fascinated by complex problems…</w:t>
+        <w:t>I’ve always been drawn to complex problems…</w:t>
       </w:r>
     </w:p>
     <w:p>
@@ -47,34 +47,49 @@
         <w:pStyle w:val="Heading1"/>
       </w:pPr>
       <w:r>
-        <w:t>…especially those that require multidisciplinary thinking.</w:t>
+        <w:t>…especially the kind that don’t fit neatly into a single discipline.</w:t>
       </w:r>
     </w:p>
     <w:p>
       <w:pPr/>
       <w:r>
+        <w:t>What do I mean by a complex problem? Sometimes it’s a new technology that people don’t quite trust yet. Sometimes it’s a product that has no obvious interaction pattern because no one has built it before. Sometimes it’s something surprisingly ordinary that millions of people experience every day without questioning it.</w:t>
+      </w:r>
+    </w:p>
+    <w:p>
+      <w:pPr>
+        <w:numPr>
+          <w:ilvl w:val="0"/>
+          <w:numId w:val="10"/>
+        </w:numPr>
+        <w:spacing w:before="0" w:after="80" w:line="276" w:lineRule="auto"/>
+        <w:ind w:left="720" w:hanging="360"/>
+      </w:pPr>
+      <w:r>
         <w:rPr>
           <w:rFonts w:ascii="Arial" w:hAnsi="Arial" w:eastAsia="Arial" w:cs="Arial"/>
+          <w:b/>
+          <w:color w:val="000000"/>
         </w:rPr>
-        <w:t>What do I mean by a complex problem? It might mean making a new technology useful, working out how a product should behave when no familiar pattern exists, or noticing a moment of everyday friction that most of us have learned to ignore. I enjoy finding out what sits behind the surface. Sometimes that means explaining it better. Sometimes it means inventing a different way of using it. Showing it. Moving it. Bringing it to life, or turning it into a standard so natural that it goes unnoticed.</w:t>
+        <w:t>Those are the problems I enjoy most.</w:t>
       </w:r>
     </w:p>
     <w:p>
       <w:pPr/>
       <w:r>
-        <w:rPr>
-          <w:rFonts w:ascii="Arial" w:hAnsi="Arial" w:eastAsia="Arial" w:cs="Arial"/>
-        </w:rPr>
-        <w:t>I started my career in Communication Design in Mainz, Germany, 13 years ago. Technology interested me, but I kept coming back to the effect an image, a typographic choice, the meaning of a word or a piece of motion can have on someone. Any of them can explain an idea and change how the person receiving it feels about it. I still find that fascinating.</w:t>
+        <w:t>I like understanding what sits underneath the surface. The technical constraints. The human behaviour. The business goals. The tiny details that quietly shape an experience. Sometimes the answer is making something simpler. Sometimes it’s creating a new interaction. Sometimes it’s explaining an idea so clearly that people forget it ever seemed complicated. The best design often disappears into the experience. I think that’s a good thing.</w:t>
       </w:r>
     </w:p>
     <w:p>
       <w:pPr/>
       <w:r>
-        <w:rPr>
-          <w:rFonts w:ascii="Arial" w:hAnsi="Arial" w:eastAsia="Arial" w:cs="Arial"/>
-        </w:rPr>
-        <w:t>My work gradually became more digital. At design agencies, I found myself becoming the digital specialist, working on interfaces, icon systems and motion, often deeply integrated with development teams. Moving to London to join Yoti made the questions more serious. Identity technology had to work properly, of course, and people also had to understand why they should trust it. That was when product, brand and communication stopped feeling like separate jobs to me.</w:t>
+        <w:t>I started my career in Communication Design in Mainz, Germany, around thirteen years ago. Although I always enjoyed technology, I kept coming back to something much more fundamental: the effect that visual communication can have on people. A single image. A typographic decision. A carefully chosen word. A piece of motion. Each can completely change how someone understands an idea, or how they feel about it. That still fascinates me today.</w:t>
+      </w:r>
+    </w:p>
+    <w:p>
+      <w:pPr/>
+      <w:r>
+        <w:t>Over time my work became increasingly digital. In agencies I naturally drifted towards interface design, motion, design systems and close collaboration with developers. Moving to London to join Yoti changed the scale of the questions I was working on. Identity technology couldn’t just function correctly. People had to trust it. That was probably the moment I stopped seeing product, brand and communication as separate disciplines. They’re all different ways of solving the same problem.</w:t>
       </w:r>
     </w:p>
     <w:p>
@@ -97,6 +112,7 @@
       <w:r>
         <w:rPr>
           <w:rFonts w:ascii="Arial" w:hAnsi="Arial" w:eastAsia="Arial" w:cs="Arial"/>
+          <w:b w:val="0"/>
           <w:color w:val="000000"/>
         </w:rPr>
         <w:t>Yoti</w:t>
@@ -114,6 +130,7 @@
       <w:r>
         <w:rPr>
           <w:rFonts w:ascii="Arial" w:hAnsi="Arial" w:eastAsia="Arial" w:cs="Arial"/>
+          <w:b w:val="0"/>
           <w:color w:val="000000"/>
         </w:rPr>
         <w:t>S&amp;P Global</w:t>
@@ -131,6 +148,7 @@
       <w:r>
         <w:rPr>
           <w:rFonts w:ascii="Arial" w:hAnsi="Arial" w:eastAsia="Arial" w:cs="Arial"/>
+          <w:b w:val="0"/>
           <w:color w:val="000000"/>
         </w:rPr>
         <w:t>Bentley</w:t>
@@ -148,6 +166,7 @@
       <w:r>
         <w:rPr>
           <w:rFonts w:ascii="Arial" w:hAnsi="Arial" w:eastAsia="Arial" w:cs="Arial"/>
+          <w:b w:val="0"/>
           <w:color w:val="000000"/>
         </w:rPr>
         <w:t>SunExpress</w:t>
@@ -165,17 +184,10 @@
       <w:r>
         <w:rPr>
           <w:rFonts w:ascii="Arial" w:hAnsi="Arial" w:eastAsia="Arial" w:cs="Arial"/>
-          <w:b/>
+          <w:b w:val="0"/>
           <w:color w:val="000000"/>
         </w:rPr>
-        <w:t>McCann</w:t>
-      </w:r>
-      <w:r>
-        <w:rPr>
-          <w:rFonts w:ascii="Arial" w:hAnsi="Arial" w:eastAsia="Arial" w:cs="Arial"/>
-          <w:color w:val="000000"/>
-        </w:rPr>
-        <w:t>: image alternative text: McCann Worldgroup</w:t>
+        <w:t>McCann Worldgroup</w:t>
       </w:r>
     </w:p>
     <w:p>
@@ -190,6 +202,7 @@
       <w:r>
         <w:rPr>
           <w:rFonts w:ascii="Arial" w:hAnsi="Arial" w:eastAsia="Arial" w:cs="Arial"/>
+          <w:b w:val="0"/>
           <w:color w:val="000000"/>
         </w:rPr>
         <w:t>American Heart Association</w:t>
@@ -207,6 +220,7 @@
       <w:r>
         <w:rPr>
           <w:rFonts w:ascii="Arial" w:hAnsi="Arial" w:eastAsia="Arial" w:cs="Arial"/>
+          <w:b w:val="0"/>
           <w:color w:val="000000"/>
         </w:rPr>
         <w:t>Sony</w:t>
@@ -224,17 +238,10 @@
       <w:r>
         <w:rPr>
           <w:rFonts w:ascii="Arial" w:hAnsi="Arial" w:eastAsia="Arial" w:cs="Arial"/>
-          <w:b/>
+          <w:b w:val="0"/>
           <w:color w:val="000000"/>
         </w:rPr>
         <w:t>Jaguar Land Rover</w:t>
-      </w:r>
-      <w:r>
-        <w:rPr>
-          <w:rFonts w:ascii="Arial" w:hAnsi="Arial" w:eastAsia="Arial" w:cs="Arial"/>
-          <w:color w:val="000000"/>
-        </w:rPr>
-        <w:t>: image alternative text: JLR</w:t>
       </w:r>
     </w:p>
     <w:p>
@@ -249,17 +256,10 @@
       <w:r>
         <w:rPr>
           <w:rFonts w:ascii="Arial" w:hAnsi="Arial" w:eastAsia="Arial" w:cs="Arial"/>
-          <w:b/>
+          <w:b w:val="0"/>
           <w:color w:val="000000"/>
         </w:rPr>
         <w:t>Maybourne Hotels</w:t>
-      </w:r>
-      <w:r>
-        <w:rPr>
-          <w:rFonts w:ascii="Arial" w:hAnsi="Arial" w:eastAsia="Arial" w:cs="Arial"/>
-          <w:color w:val="000000"/>
-        </w:rPr>
-        <w:t>: image alternative text: Maybourne</w:t>
       </w:r>
     </w:p>
     <w:p>
@@ -274,6 +274,7 @@
       <w:r>
         <w:rPr>
           <w:rFonts w:ascii="Arial" w:hAnsi="Arial" w:eastAsia="Arial" w:cs="Arial"/>
+          <w:b w:val="0"/>
           <w:color w:val="000000"/>
         </w:rPr>
         <w:t>Experian</w:t>
@@ -291,6 +292,7 @@
       <w:r>
         <w:rPr>
           <w:rFonts w:ascii="Arial" w:hAnsi="Arial" w:eastAsia="Arial" w:cs="Arial"/>
+          <w:b w:val="0"/>
           <w:color w:val="000000"/>
         </w:rPr>
         <w:t>Data Communications Company</w:t>
@@ -308,6 +310,7 @@
       <w:r>
         <w:rPr>
           <w:rFonts w:ascii="Arial" w:hAnsi="Arial" w:eastAsia="Arial" w:cs="Arial"/>
+          <w:b w:val="0"/>
           <w:color w:val="000000"/>
         </w:rPr>
         <w:t>Tourism Ireland</w:t>
@@ -325,6 +328,7 @@
       <w:r>
         <w:rPr>
           <w:rFonts w:ascii="Arial" w:hAnsi="Arial" w:eastAsia="Arial" w:cs="Arial"/>
+          <w:b w:val="0"/>
           <w:color w:val="000000"/>
         </w:rPr>
         <w:t>Lufthansa</w:t>
@@ -342,6 +346,7 @@
       <w:r>
         <w:rPr>
           <w:rFonts w:ascii="Arial" w:hAnsi="Arial" w:eastAsia="Arial" w:cs="Arial"/>
+          <w:b w:val="0"/>
           <w:color w:val="000000"/>
         </w:rPr>
         <w:t>General Motors</w:t>
@@ -352,9 +357,6 @@
         <w:pStyle w:val="Heading1"/>
       </w:pPr>
       <w:r>
-        <w:rPr>
-          <w:rFonts w:ascii="Arial" w:hAnsi="Arial" w:eastAsia="Arial" w:cs="Arial"/>
-        </w:rPr>
         <w:t>The more complex the questions became…</w:t>
       </w:r>
     </w:p>
@@ -363,10 +365,7 @@
         <w:pStyle w:val="Heading1"/>
       </w:pPr>
       <w:r>
-        <w:rPr>
-          <w:rFonts w:ascii="Arial" w:hAnsi="Arial" w:eastAsia="Arial" w:cs="Arial"/>
-        </w:rPr>
-        <w:t>…the more often I had to look beyond a single discipline.</w:t>
+        <w:t>…the more often I found myself working across disciplines.</w:t>
       </w:r>
     </w:p>
     <w:p>
@@ -399,7 +398,7 @@
           <w:rFonts w:ascii="Arial" w:hAnsi="Arial" w:eastAsia="Arial" w:cs="Arial"/>
           <w:color w:val="000000"/>
         </w:rPr>
-        <w:t>: Understanding what people need, then working out what the product should do.</w:t>
+        <w:t>: Understanding what people actually need before deciding what should be built.</w:t>
       </w:r>
     </w:p>
     <w:p>
@@ -424,7 +423,7 @@
           <w:rFonts w:ascii="Arial" w:hAnsi="Arial" w:eastAsia="Arial" w:cs="Arial"/>
           <w:color w:val="000000"/>
         </w:rPr>
-        <w:t>: Looking at the whole journey, including the parts no one owns yet.</w:t>
+        <w:t>: Looking at the whole journey, including the awkward gaps between teams, systems and touchpoints.</w:t>
       </w:r>
     </w:p>
     <w:p>
@@ -449,7 +448,7 @@
           <w:rFonts w:ascii="Arial" w:hAnsi="Arial" w:eastAsia="Arial" w:cs="Arial"/>
           <w:color w:val="000000"/>
         </w:rPr>
-        <w:t>: Finding a visual idea that gives the work its own character.</w:t>
+        <w:t>: Finding a visual idea that gives the work its own personality.</w:t>
       </w:r>
     </w:p>
     <w:p>
@@ -474,7 +473,7 @@
           <w:rFonts w:ascii="Arial" w:hAnsi="Arial" w:eastAsia="Arial" w:cs="Arial"/>
           <w:color w:val="000000"/>
         </w:rPr>
-        <w:t>: Using movement and space when a flat explanation is not enough.</w:t>
+        <w:t>: Using movement and space when static design isn’t enough.</w:t>
       </w:r>
     </w:p>
     <w:p>
@@ -499,7 +498,7 @@
           <w:rFonts w:ascii="Arial" w:hAnsi="Arial" w:eastAsia="Arial" w:cs="Arial"/>
           <w:color w:val="000000"/>
         </w:rPr>
-        <w:t>: Making ideas in code so I can see how they really behave.</w:t>
+        <w:t>: Building ideas in code so they can be tested instead of imagined.</w:t>
       </w:r>
     </w:p>
     <w:p>
@@ -524,25 +523,49 @@
           <w:rFonts w:ascii="Arial" w:hAnsi="Arial" w:eastAsia="Arial" w:cs="Arial"/>
           <w:color w:val="000000"/>
         </w:rPr>
-        <w:t>: Creating rules that allow variety without becoming chaotic.</w:t>
+        <w:t>: Creating flexible systems that stay coherent as they grow.</w:t>
       </w:r>
     </w:p>
     <w:p>
       <w:pPr/>
       <w:r>
-        <w:t>When I start a project, I tend to disappear into it for a while. I ask questions, collect references and speak to the people who know the subject properly. Quite often the brief is only one version of the story. Making something early helps me check what I have understood. Even a rough prototype can show where everyone agrees and where they really don’t.</w:t>
+        <w:t>When I begin a project I tend to disappear into it for a while. I ask a lot of questions. I collect references from unexpected places. I speak to the people who understand the problem better than anyone else.</w:t>
+      </w:r>
+    </w:p>
+    <w:p>
+      <w:pPr>
+        <w:numPr>
+          <w:ilvl w:val="0"/>
+          <w:numId w:val="10"/>
+        </w:numPr>
+        <w:spacing w:before="0" w:after="80" w:line="276" w:lineRule="auto"/>
+        <w:ind w:left="720" w:hanging="360"/>
+      </w:pPr>
+      <w:r>
+        <w:rPr>
+          <w:rFonts w:ascii="Arial" w:hAnsi="Arial" w:eastAsia="Arial" w:cs="Arial"/>
+          <w:b/>
+          <w:color w:val="000000"/>
+        </w:rPr>
+        <w:t>I’ve learned that the brief is often only part of the story.</w:t>
       </w:r>
     </w:p>
     <w:p>
       <w:pPr/>
       <w:r>
-        <w:t>I like giving the work a strong direction, although I don’t expect my first idea to survive untouched. The people around the project should be able to change it. I stay close when it is built too, partly because I enjoy that part and partly because I have seen good ideas lose their character in the final implementation.</w:t>
+        <w:t>I also like making things early. Not because they are finished, but because they reveal where everyone’s assumptions begin to fall apart. A rough prototype can create better conversations than a polished presentation.</w:t>
       </w:r>
     </w:p>
     <w:p>
       <w:pPr/>
       <w:r>
-        <w:t>AI has opened another area for me. I use it most days to explore ideas, make prototypes and sometimes simply to get unstuck. It is incredibly useful. It also makes it very easy to produce work that looks finished before anyone has asked whether it is any good. That worries me. I think the purposeful use of AI depends on people remaining responsible for what they make and why.</w:t>
+        <w:t>I care about giving projects a strong point of view, but I’m not precious about my ideas. Good work gets better when smart people challenge it. I also stay close to development. Partly because I genuinely enjoy building things. Mostly because I’ve seen too many good ideas lose what made them special during implementation.</w:t>
+      </w:r>
+    </w:p>
+    <w:p>
+      <w:pPr/>
+      <w:r>
+        <w:t>AI has become another tool I use almost every day. It helps me think faster, prototype earlier and explore ideas I wouldn’t have had time to pursue before. It’s an incredible amplifier. It’s also incredibly good at producing work that looks convincing before anyone has asked whether it’s solving the right problem. That feels like an important distinction. I think AI becomes valuable when it strengthens human judgement, not when it replaces it.</w:t>
       </w:r>
     </w:p>
     <w:p>
@@ -565,6 +588,7 @@
       <w:r>
         <w:rPr>
           <w:rFonts w:ascii="Arial" w:hAnsi="Arial" w:eastAsia="Arial" w:cs="Arial"/>
+          <w:b w:val="0"/>
           <w:color w:val="000000"/>
         </w:rPr>
         <w:t>Abstract cobalt poster study</w:t>
@@ -582,6 +606,7 @@
       <w:r>
         <w:rPr>
           <w:rFonts w:ascii="Arial" w:hAnsi="Arial" w:eastAsia="Arial" w:cs="Arial"/>
+          <w:b w:val="0"/>
           <w:color w:val="000000"/>
         </w:rPr>
         <w:t>Layered translucent material experiment</w:t>
@@ -599,6 +624,7 @@
       <w:r>
         <w:rPr>
           <w:rFonts w:ascii="Arial" w:hAnsi="Arial" w:eastAsia="Arial" w:cs="Arial"/>
+          <w:b w:val="0"/>
           <w:color w:val="000000"/>
         </w:rPr>
         <w:t>Orange geometric print fragment</w:t>
@@ -616,6 +642,7 @@
       <w:r>
         <w:rPr>
           <w:rFonts w:ascii="Arial" w:hAnsi="Arial" w:eastAsia="Arial" w:cs="Arial"/>
+          <w:b w:val="0"/>
           <w:color w:val="000000"/>
         </w:rPr>
         <w:t>Dark interface motion study</w:t>
@@ -633,6 +660,7 @@
       <w:r>
         <w:rPr>
           <w:rFonts w:ascii="Arial" w:hAnsi="Arial" w:eastAsia="Arial" w:cs="Arial"/>
+          <w:b w:val="0"/>
           <w:color w:val="000000"/>
         </w:rPr>
         <w:t>Red typographic poster detail</w:t>
@@ -650,6 +678,7 @@
       <w:r>
         <w:rPr>
           <w:rFonts w:ascii="Arial" w:hAnsi="Arial" w:eastAsia="Arial" w:cs="Arial"/>
+          <w:b w:val="0"/>
           <w:color w:val="000000"/>
         </w:rPr>
         <w:t>Blue architectural model photograph</w:t>
@@ -667,6 +696,7 @@
       <w:r>
         <w:rPr>
           <w:rFonts w:ascii="Arial" w:hAnsi="Arial" w:eastAsia="Arial" w:cs="Arial"/>
+          <w:b w:val="0"/>
           <w:color w:val="000000"/>
         </w:rPr>
         <w:t>Minimal editorial layout study</w:t>
@@ -684,6 +714,7 @@
       <w:r>
         <w:rPr>
           <w:rFonts w:ascii="Arial" w:hAnsi="Arial" w:eastAsia="Arial" w:cs="Arial"/>
+          <w:b w:val="0"/>
           <w:color w:val="000000"/>
         </w:rPr>
         <w:t>Violet light and texture experiment</w:t>
@@ -701,6 +732,7 @@
       <w:r>
         <w:rPr>
           <w:rFonts w:ascii="Arial" w:hAnsi="Arial" w:eastAsia="Arial" w:cs="Arial"/>
+          <w:b w:val="0"/>
           <w:color w:val="000000"/>
         </w:rPr>
         <w:t>Green product form study</w:t>
@@ -718,6 +750,7 @@
       <w:r>
         <w:rPr>
           <w:rFonts w:ascii="Arial" w:hAnsi="Arial" w:eastAsia="Arial" w:cs="Arial"/>
+          <w:b w:val="0"/>
           <w:color w:val="000000"/>
         </w:rPr>
         <w:t>Monochrome exhibition graphic</w:t>
@@ -735,6 +768,7 @@
       <w:r>
         <w:rPr>
           <w:rFonts w:ascii="Arial" w:hAnsi="Arial" w:eastAsia="Arial" w:cs="Arial"/>
+          <w:b w:val="0"/>
           <w:color w:val="000000"/>
         </w:rPr>
         <w:t>Warm studio process photograph</w:t>
@@ -752,6 +786,7 @@
       <w:r>
         <w:rPr>
           <w:rFonts w:ascii="Arial" w:hAnsi="Arial" w:eastAsia="Arial" w:cs="Arial"/>
+          <w:b w:val="0"/>
           <w:color w:val="000000"/>
         </w:rPr>
         <w:t>Cyan digital artifact composition</w:t>
@@ -769,6 +804,7 @@
       <w:r>
         <w:rPr>
           <w:rFonts w:ascii="Arial" w:hAnsi="Arial" w:eastAsia="Arial" w:cs="Arial"/>
+          <w:b w:val="0"/>
           <w:color w:val="000000"/>
         </w:rPr>
         <w:t>Folded paper prototype detail</w:t>
@@ -786,6 +822,7 @@
       <w:r>
         <w:rPr>
           <w:rFonts w:ascii="Arial" w:hAnsi="Arial" w:eastAsia="Arial" w:cs="Arial"/>
+          <w:b w:val="0"/>
           <w:color w:val="000000"/>
         </w:rPr>
         <w:t>Black and white spatial sketch</w:t>
@@ -803,6 +840,7 @@
       <w:r>
         <w:rPr>
           <w:rFonts w:ascii="Arial" w:hAnsi="Arial" w:eastAsia="Arial" w:cs="Arial"/>
+          <w:b w:val="0"/>
           <w:color w:val="000000"/>
         </w:rPr>
         <w:t>Yellow modular identity study</w:t>
@@ -820,6 +858,7 @@
       <w:r>
         <w:rPr>
           <w:rFonts w:ascii="Arial" w:hAnsi="Arial" w:eastAsia="Arial" w:cs="Arial"/>
+          <w:b w:val="0"/>
           <w:color w:val="000000"/>
         </w:rPr>
         <w:t>Reflective sculptural object photograph</w:t>
@@ -837,6 +876,7 @@
       <w:r>
         <w:rPr>
           <w:rFonts w:ascii="Arial" w:hAnsi="Arial" w:eastAsia="Arial" w:cs="Arial"/>
+          <w:b w:val="0"/>
           <w:color w:val="000000"/>
         </w:rPr>
         <w:t>Magenta animation frame study</w:t>
@@ -854,6 +894,7 @@
       <w:r>
         <w:rPr>
           <w:rFonts w:ascii="Arial" w:hAnsi="Arial" w:eastAsia="Arial" w:cs="Arial"/>
+          <w:b w:val="0"/>
           <w:color w:val="000000"/>
         </w:rPr>
         <w:t>Blue grid and light composition</w:t>
@@ -871,6 +912,7 @@
       <w:r>
         <w:rPr>
           <w:rFonts w:ascii="Arial" w:hAnsi="Arial" w:eastAsia="Arial" w:cs="Arial"/>
+          <w:b w:val="0"/>
           <w:color w:val="000000"/>
         </w:rPr>
         <w:t>Red and cream print experiment</w:t>
@@ -888,15 +930,16 @@
       <w:r>
         <w:rPr>
           <w:rFonts w:ascii="Arial" w:hAnsi="Arial" w:eastAsia="Arial" w:cs="Arial"/>
+          <w:b w:val="0"/>
           <w:color w:val="000000"/>
         </w:rPr>
-        <w:t>Nighttime installation moment</w:t>
+        <w:t>Night-time installation moment</w:t>
       </w:r>
     </w:p>
     <w:p>
       <w:pPr/>
       <w:r>
-        <w:t>Not everything I make begins with a brief. Sometimes it starts with a small thing that keeps bothering me. The iOS keyboard was one of those, so I started redesigning it. Trust, privacy and robotics are on my mind too. I’m following those questions to see where they lead.</w:t>
+        <w:t>Not everything I build starts with a client. Quite often it starts with a question that refuses to leave me alone. Recently that’s included redesigning the iOS keyboard, exploring better ways for people to understand AI, thinking about trust in digital products, and experimenting with robotics and creative engineering. I don’t always know where those projects will end up. Following them is part of the point.</w:t>
       </w:r>
     </w:p>
     <w:p>
@@ -912,7 +955,7 @@
         <w:pStyle w:val="Heading1"/>
       </w:pPr>
       <w:r>
-        <w:t>…they change one another as the work develops…</w:t>
+        <w:t>…they influence one another…</w:t>
       </w:r>
     </w:p>
     <w:p>
@@ -920,7 +963,7 @@
         <w:pStyle w:val="Heading1"/>
       </w:pPr>
       <w:r>
-        <w:t>…until the combination becomes something of its own.</w:t>
+        <w:t>…until something new starts to emerge.</w:t>
       </w:r>
     </w:p>
     <w:p>
@@ -934,7 +977,7 @@
     <w:p>
       <w:pPr/>
       <w:r>
-        <w:t>If you have a complex problem in mind, I’d be curious to hear about it.</w:t>
+        <w:t>If you’re working on something genuinely difficult, I’d love to hear about it.</w:t>
       </w:r>
     </w:p>
     <w:p>

</xml_diff>